<commit_message>
docs: add native 2D drawing and assembly workflow
Document associative dimensions, sections, details, PDF validation,
reference portability, authorized cleanup and recreated video capture.
Refresh public repository access, Word guide and documentation tests.

Co-Authored-By: Claude Code <noreply@anthropic.com>
</commit_message>
<xml_diff>
--- a/docs/GUIA-COMPLETO.docx
+++ b/docs/GUIA-COMPLETO.docx
@@ -12,7 +12,7 @@
     </w:p>
     <w:p>
       <w:r>
-        <w:t>Referência: 10 de setembro de 2026. Laboratório replicável para pessoas e agentes de IA, com exemplos sintéticos, sem arquivos de produtos reais. O Word GUIA-COMPLETO.docx é gerado desta mesma fonte. Scripts e fontes VBA estão no repo privado https://github.com/eludvic-gif/solidworks-ai-starter.</w:t>
+        <w:t>Referência: 11 de setembro de 2026. Laboratório replicável para pessoas e agentes de IA, com exemplos sintéticos, sem arquivos de produtos reais. O Word GUIA-COMPLETO.docx é gerado desta mesma fonte. Repositório público: https://github.com/eludvic-gif/solidworks-ai-starter ; fork: https://github.com/ericludvic-79/solidworks-ai-starter. A seção 24 acrescenta o fluxo de desenhos 2D nativos e montagem.</w:t>
       </w:r>
     </w:p>
     <w:p>
@@ -334,7 +334,7 @@
     </w:p>
     <w:p>
       <w:r>
-        <w:t>O repo é privado: outra pessoa precisa receber acesso do proprietário. O link sozinho não concede permissão. Entre com sua própria conta GitHub.</w:t>
+        <w:t>O repo é público: não é necessário convite para ler ou baixar. Para operações autenticadas, use sua própria conta GitHub. O fork na segunda conta não recebe futuras atualizações automaticamente; precisa de sincronização explícita.</w:t>
       </w:r>
     </w:p>
     <w:p>
@@ -2112,7 +2112,7 @@
     </w:p>
     <w:p>
       <w:r>
-        <w:t>Fluxo original demonstrado em SOLIDWORKS2025SP5. Nesta preparação: testes Python, guardas estáticas, política de conexão, sintaxe PowerShell, compilação C# com interop local e estrutura/conteúdo Word. Não se abriu, conectou, modelou ou fechou SOLIDWORKS para gerar este kit.</w:t>
+        <w:t>Na preparação inicial de 2026-09-10: testes Python, guardas estáticas, política de conexão, sintaxe PowerShell, compilação C# com interop local e estrutura/conteúdo Word. Não se abriu, conectou, modelou ou fechou SOLIDWORKS para gerar o kit inicial. Em 2026-09-11 foi acrescentada documentação genérica baseada em operações de desenho demonstradas separadamente no laboratório local; não foram incorporados seus arquivos/modelos privados. A atualização do repositório é documental, sem nova execução CAD para validar o exercício sintético 2D.</w:t>
       </w:r>
     </w:p>
     <w:p>
@@ -2205,6 +2205,320 @@
     <w:p>
       <w:r>
         <w:t>Consulte troubleshooting (TROUBLESHOOTING.md), validação (VALIDACAO.md), skills (SKILLS.md), prompts (prompts/), checklist de release (RELEASE-CHECKLIST.md) e smoke test (SMOKE-TEST.md). Para outra IA, forneça este guia, arquivos do kit e instrução para ler AGENTS.md antes de agir.</w:t>
+      </w:r>
+    </w:p>
+    <w:p>
+      <w:pPr>
+        <w:pStyle w:val="Heading2"/>
+      </w:pPr>
+      <w:r>
+        <w:t>24. Do modelo ao desenho 2D nativo</w:t>
+      </w:r>
+    </w:p>
+    <w:p>
+      <w:r>
+        <w:t>Este roteiro também integra o Word. O módulo DESENHOS-2D.md (DESENHOS-2D.md) detalha contratos da API, exemplos e diagnóstico; o prompt 2D (prompts/05-desenho-2d.md) ajuda a iniciar outra sessão. Não há gerador universal nem arquivos CAD reais incluídos. As operações foram demonstradas em laboratório no SOLIDWORKS 2025 SP5; reproduza um piloto sintético antes de confiar em outra instalação.</w:t>
+      </w:r>
+    </w:p>
+    <w:p>
+      <w:pPr>
+        <w:pStyle w:val="Heading3"/>
+      </w:pPr>
+      <w:r>
+        <w:t>Etapa A — requisitos, padrão e fonte</w:t>
+      </w:r>
+    </w:p>
+    <w:p>
+      <w:pPr>
+        <w:ind w:left="170"/>
+      </w:pPr>
+      <w:r>
+        <w:t>1. Defina modelo/configuração, material/processo, escopo de fornecimento, interfaces e critérios. Diferencie corpo, acessórios e montagem.</w:t>
+      </w:r>
+    </w:p>
+    <w:p>
+      <w:pPr>
+        <w:ind w:left="170"/>
+      </w:pPr>
+      <w:r>
+        <w:t>2. Use DRWDOT/SLDDRT autorizado ou PDF de referência. Confira projeção, folha, escalas, texto, borda e carimbo. Reconstrução simplificada não é reprodução exata; nunca herde assinaturas ou aprovações.</w:t>
+      </w:r>
+    </w:p>
+    <w:p>
+      <w:pPr>
+        <w:ind w:left="170"/>
+      </w:pPr>
+      <w:r>
+        <w:t>3. Inventarie PID/documentos/caminhos/configurações/alterações. Copie as fontes para pasta nova, com nomes exclusivos e hashes. Não altere originais nem use ActiveDoc como fallback.</w:t>
+      </w:r>
+    </w:p>
+    <w:p>
+      <w:pPr>
+        <w:ind w:left="170"/>
+      </w:pPr>
+      <w:r>
+        <w:t>4. Meça BREP: envelope real, planos de apoio, cilindros, centros, raios, profundidades e fundos. Modelo importado pode não ter cotas de esboço; não medir screenshots.</w:t>
+      </w:r>
+    </w:p>
+    <w:p>
+      <w:pPr>
+        <w:ind w:left="170"/>
+      </w:pPr>
+      <w:r>
+        <w:t>5. Monte matriz característica → vista/cota → tolerância → inspeção. Classifique tolerâncias antigas como transferíveis com evidência, propostas ou pendentes. Modelo 3D não fornece sozinho limites de aceitação.</w:t>
+      </w:r>
+    </w:p>
+    <w:p>
+      <w:pPr>
+        <w:pStyle w:val="Heading3"/>
+      </w:pPr>
+      <w:r>
+        <w:t>Etapa B — prova de API e vistas</w:t>
+      </w:r>
+    </w:p>
+    <w:p>
+      <w:r>
+        <w:t>Confirme assinaturas e enums por reflexão da interop local antes de executar. NewDocument cria desenho por template; retorno nulo/tipo incorreto deve interromper. GetModelViewNames permite descobrir nomes localizados. CreateDrawViewFromModelView3 cria vista associada à fonte; confirme ReferencedConfiguration, escala e posição em metros na folha.</w:t>
+      </w:r>
+    </w:p>
+    <w:p>
+      <w:r>
+        <w:t>Prove uma vista e uma cota no exercício sintético da placa. Localize duas arestas BREP, limpe a seleção, use View.SelectEntity e AddHorizontalDimension2 ou AddVerticalDimension2. A posição da anotação não define o valor: leia Dimension.SystemValue, compare à geometria, confira Annotation.IsDangling, DisplayDimension.GetOverride e entidades anexadas. Não sobrescreva texto para esconder valor errado. Radial/diametral/quantidade precisam corresponder à entidade real.</w:t>
+      </w:r>
+    </w:p>
+    <w:p>
+      <w:r>
+        <w:t>Só replique após salvar e reabrir a prova. Vistas ortográficas devem obedecer ao diedro; vistas nomeadas independentes não são automaticamente vistas projetadas alinhadas. No ambiente de referência, modo wireframe (0) mostrava arestas posteriores; hidden-lines-removed (swHIDDEN, 2) foi adequado. Confirme enum, não adivinhe número.</w:t>
+      </w:r>
+    </w:p>
+    <w:p>
+      <w:pPr>
+        <w:pStyle w:val="Heading3"/>
+      </w:pPr>
+      <w:r>
+        <w:t>Etapa C — cortes, detalhes e carimbo</w:t>
+      </w:r>
+    </w:p>
+    <w:p>
+      <w:pPr>
+        <w:ind w:left="170"/>
+      </w:pPr>
+      <w:r>
+        <w:t>1. Ative vista-pai própria e limpe seleção. Para o corte, transforme pontos modelo → folha → esboço da vista; não misture metros da folha com coordenadas locais do sketch.</w:t>
+      </w:r>
+    </w:p>
+    <w:p>
+      <w:pPr>
+        <w:ind w:left="170"/>
+      </w:pPr>
+      <w:r>
+        <w:t>2. Crie linha, selecione-a e chame CreateSectionViewAt5 com opções verificadas. Confira plano, direção, hachura e topologia revelada: retorno não nulo pode esconder corte fora do lugar.</w:t>
+      </w:r>
+    </w:p>
+    <w:p>
+      <w:pPr>
+        <w:ind w:left="170"/>
+      </w:pPr>
+      <w:r>
+        <w:t>3. Para detalhe, círculo no esboço correto e CreateDetailViewAt4; confira região, chamada, label e escala. Cote arestas efetivamente visíveis na seção/detalhe.</w:t>
+      </w:r>
+    </w:p>
+    <w:p>
+      <w:pPr>
+        <w:ind w:left="170"/>
+      </w:pPr>
+      <w:r>
+        <w:t>4. EditTemplate/EditSheet separam formato e conteúdo. Para linhas curtas, AddToDB pode evitar snapping; preserve/restaure seu estado em finally. Formate texto pela Annotation e confira tamanho físico.</w:t>
+      </w:r>
+    </w:p>
+    <w:p>
+      <w:pPr>
+        <w:ind w:left="170"/>
+      </w:pPr>
+      <w:r>
+        <w:t>5. Distribua cotas sem cadeias redundantes e sem texto sobre geometria. Prefira outra folha a reduzir legibilidade. Não omita recurso funcional para o build passar.</w:t>
+      </w:r>
+    </w:p>
+    <w:p>
+      <w:pPr>
+        <w:pStyle w:val="Heading3"/>
+      </w:pPr>
+      <w:r>
+        <w:t>Etapa D — montagem e camadas</w:t>
+      </w:r>
+    </w:p>
+    <w:p>
+      <w:r>
+        <w:t>Crie SLDASM próprio com componentes autorizados e transformações rígidas; AddComponent5 pode precisar dos modelos carregados. Verifique o caminho retornado e Transform2, sem escala. Fixar componentes não cria mates funcionais. Confirme apoios, direção de inserção, interferências e ordem das camadas; material compressível exige ensaio.</w:t>
+      </w:r>
+    </w:p>
+    <w:p>
+      <w:r>
+        <w:t>Exemplo exclusivamente sintético: suporte de 12 mm, encaixe de 2 mm, camadas de 6 e 18 mm resultam em altura nominal de 34 mm sem compressão/adesivo. Não extrapole o cálculo para outro conjunto sem medir o apoio. Represente conjunto montado, corte, lista/quantidades, isométrica e sequência. A seleção de arestas de componentes deve respeitar suas coordenadas locais e transformações.</w:t>
+      </w:r>
+    </w:p>
+    <w:p>
+      <w:r>
+        <w:t>Não chame outra montagem com componentes afastados de configuração explodida nativa: identifique-a como ilustração. O fluxo de passos de explosão nativa não foi validado ponta a ponta neste aprendizado. Balões/BOM, hachuras distintas e fixação real continuam sujeitos à verificação.</w:t>
+      </w:r>
+    </w:p>
+    <w:p>
+      <w:pPr>
+        <w:pStyle w:val="Heading3"/>
+      </w:pPr>
+      <w:r>
+        <w:t>Etapa E — nativo, PDF e pacote</w:t>
+      </w:r>
+    </w:p>
+    <w:p>
+      <w:pPr>
+        <w:ind w:left="170"/>
+      </w:pPr>
+      <w:r>
+        <w:t>1. Salve SLDDRW em nome novo, conferindo retorno, erros/avisos e existência.</w:t>
+      </w:r>
+    </w:p>
+    <w:p>
+      <w:pPr>
+        <w:ind w:left="170"/>
+      </w:pPr>
+      <w:r>
+        <w:t>2. Obtenha ExportPdfData e selecione explicitamente nomes de todas as folhas com SetSheets; array nulo falhou no ambiente de referência. Confira retorno antes de SaveAs.</w:t>
+      </w:r>
+    </w:p>
+    <w:p>
+      <w:pPr>
+        <w:ind w:left="170"/>
+      </w:pPr>
+      <w:r>
+        <w:t>3. Reabra cópia do nativo e confira fonte/configuração, vistas não vazias, cotas, vínculos, unidades e erros. Contagem de cotas não prova cobertura.</w:t>
+      </w:r>
+    </w:p>
+    <w:p>
+      <w:pPr>
+        <w:ind w:left="170"/>
+      </w:pPr>
+      <w:r>
+        <w:t>4. Renderize e inspecione todas as páginas do PDF: tamanho físico, escalas, símbolos, hachuras, contraste e sobreposição. PDFium com Pillow foi uma opção local; o kit não instala renderizador.</w:t>
+      </w:r>
+    </w:p>
+    <w:p>
+      <w:pPr>
+        <w:ind w:left="170"/>
+      </w:pPr>
+      <w:r>
+        <w:t>5. Inspecione GetPackAndGo/GetDocumentNames antes de empacotar. Uma SLDPRT pode depender de STEP por 3D Interconnect. Preserve fontes e confira colisões de nome.</w:t>
+      </w:r>
+    </w:p>
+    <w:p>
+      <w:pPr>
+        <w:ind w:left="170"/>
+      </w:pPr>
+      <w:r>
+        <w:t>6. Pack and Go bem-sucedido não prova relink. Audite dependências gravadas e resolvidas, e reabra a entrega em ambiente isolado sem originais. ReplaceReferencedDocument não resolveu todo vínculo Interconnect no laboratório. Se não houver essa prova, declare portabilidade não validada.</w:t>
+      </w:r>
+    </w:p>
+    <w:p>
+      <w:pPr>
+        <w:pStyle w:val="Heading3"/>
+      </w:pPr>
+      <w:r>
+        <w:t>Etapa F — conclusão, limpeza e demonstração</w:t>
+      </w:r>
+    </w:p>
+    <w:p>
+      <w:r>
+        <w:t>Mantenha PARA REVISÃO — NÃO LIBERADO PARA FABRICAÇÃO enquanto material, tolerâncias, inspeção ou aprovação estiverem pendentes. Entregue matriz de cobertura, fontes/hashes, testes realizados e limitações. A aprovação estética não substitui engenharia.</w:t>
+      </w:r>
+    </w:p>
+    <w:p>
+      <w:r>
+        <w:t>Depois da validação e com autorização de limpeza, inventarie dependências transitivas e documentos abertos. Remova apenas temporários próprios identificados por caminho e hash, preferencialmente pela Lixeira, mantendo finais, fontes, registros e qualquer arquivo incerto. Igualdade de hash não torna um arquivo removível se ele é referenciado. Feche apenas cópias próprias sem alterações externas. Não configure exclusão automática no evento Stop de um assistente.</w:t>
+      </w:r>
+    </w:p>
+    <w:p>
+      <w:r>
+        <w:t>Para vídeo, recrie etapas em cópias. Identifique demonstração recriada e capture somente janela CAD por HWND/PID, sem fallback para desktop. Preserve gravações existentes, confira codec/duração/decodificação e quadros; relógio do log não é timecode quando há perda de frames. Capture os clipes novos separadamente, faça prévia em outro arquivo e revise confidencialidade antes de publicar. Vídeo não é evidência de aprovação dimensional nem benchmark de tempo real.</w:t>
+      </w:r>
+    </w:p>
+    <w:p>
+      <w:pPr>
+        <w:pStyle w:val="Heading3"/>
+      </w:pPr>
+      <w:r>
+        <w:t>Checklist 2D adicional</w:t>
+      </w:r>
+    </w:p>
+    <w:p>
+      <w:pPr>
+        <w:pStyle w:val="ListBullet"/>
+      </w:pPr>
+      <w:r>
+        <w:t>[ ] Fonte/configuração e padrão local confirmados; cópias com hashes.</w:t>
+      </w:r>
+    </w:p>
+    <w:p>
+      <w:pPr>
+        <w:pStyle w:val="ListBullet"/>
+      </w:pPr>
+      <w:r>
+        <w:t>[ ] Matriz de cobertura e tolerâncias/pendências explícitas.</w:t>
+      </w:r>
+    </w:p>
+    <w:p>
+      <w:pPr>
+        <w:pStyle w:val="ListBullet"/>
+      </w:pPr>
+      <w:r>
+        <w:t>[ ] Piloto de vista/cota associativa salvo e reaberto.</w:t>
+      </w:r>
+    </w:p>
+    <w:p>
+      <w:pPr>
+        <w:pStyle w:val="ListBullet"/>
+      </w:pPr>
+      <w:r>
+        <w:t>[ ] Cortes/detalhes com transformações e regiões conferidas.</w:t>
+      </w:r>
+    </w:p>
+    <w:p>
+      <w:pPr>
+        <w:pStyle w:val="ListBullet"/>
+      </w:pPr>
+      <w:r>
+        <w:t>[ ] Montagem, quantidades, apoios e hipóteses de compressão verificadas, se aplicável.</w:t>
+      </w:r>
+    </w:p>
+    <w:p>
+      <w:pPr>
+        <w:pStyle w:val="ListBullet"/>
+      </w:pPr>
+      <w:r>
+        <w:t>[ ] Todas as folhas PDF e nativas revisadas; sem dangling/override ocultando erro.</w:t>
+      </w:r>
+    </w:p>
+    <w:p>
+      <w:pPr>
+        <w:pStyle w:val="ListBullet"/>
+      </w:pPr>
+      <w:r>
+        <w:t>[ ] Referências do pacote auditadas e portabilidade comprovada ou marcada pendente.</w:t>
+      </w:r>
+    </w:p>
+    <w:p>
+      <w:pPr>
+        <w:pStyle w:val="ListBullet"/>
+      </w:pPr>
+      <w:r>
+        <w:t>[ ] Limpeza autorizada sem apagar fontes/dependências; finais acessíveis.</w:t>
+      </w:r>
+    </w:p>
+    <w:p>
+      <w:pPr>
+        <w:pStyle w:val="ListBullet"/>
+      </w:pPr>
+      <w:r>
+        <w:t>[ ] Nenhuma liberação de fabricação, assinatura ou teste físico inferido.</w:t>
       </w:r>
     </w:p>
     <w:sectPr>

</xml_diff>

<commit_message>
docs: preserve ISO drawing review knowledge and offline checks
Add sanitized standards metadata, review guidance, synthetic example and tested JSON review CLI. Update agent instructions and generated Word without distributing standards or private CAD evidence.

Co-Authored-By: Claude Code <noreply@anthropic.com>
</commit_message>
<xml_diff>
--- a/docs/GUIA-COMPLETO.docx
+++ b/docs/GUIA-COMPLETO.docx
@@ -12,7 +12,7 @@
     </w:p>
     <w:p>
       <w:r>
-        <w:t>Referência: 11 de setembro de 2026. Laboratório replicável para pessoas e agentes de IA, com exemplos sintéticos, sem arquivos de produtos reais. O Word GUIA-COMPLETO.docx é gerado desta mesma fonte. Repositório público: https://github.com/eludvic-gif/solidworks-ai-starter ; fork: https://github.com/ericludvic-79/solidworks-ai-starter. A seção 24 acrescenta o fluxo de desenhos 2D nativos e montagem.</w:t>
+        <w:t>Referência: 12 de setembro de 2026. Laboratório replicável para pessoas e agentes de IA, com exemplos sintéticos, sem arquivos de produtos reais. O Word GUIA-COMPLETO.docx é gerado desta mesma fonte. Repositório público: https://github.com/eludvic-gif/solidworks-ai-starter ; fork: https://github.com/ericludvic-79/solidworks-ai-starter. A seção 24 acrescenta o fluxo de desenhos 2D nativos e montagem.</w:t>
       </w:r>
     </w:p>
     <w:p>
@@ -2519,6 +2519,58 @@
       </w:pPr>
       <w:r>
         <w:t>[ ] Nenhuma liberação de fabricação, assinatura ou teste físico inferido.</w:t>
+      </w:r>
+    </w:p>
+    <w:p>
+      <w:pPr>
+        <w:pStyle w:val="Heading2"/>
+      </w:pPr>
+      <w:r>
+        <w:t>25. Preservação do conhecimento normativo e revisão 2D</w:t>
+      </w:r>
+    </w:p>
+    <w:p>
+      <w:r>
+        <w:t>O módulo NORMAS-2D.md (NORMAS-2D.md) e o registro standards/registry.json preservam 20 registros de normas, incluindo históricos, e 8 relações de substituição. São metadados e resumos originais: normas integrais, prévias PDF, extrações e dados privados não acompanham o kit. A consulta de 2026-09-12 usou catálogo e prévias oficiais parciais; nenhuma norma foi lida integralmente. Não confundir ano nacional/ISO, sumário/cláusula lida ou sucessão documental/equivalência técnica.</w:t>
+      </w:r>
+    </w:p>
+    <w:p>
+      <w:r>
+        <w:t>Principais atualizações identificadas: ISO 5459:2024 substitui 2011; ISO 14405-1:2025 substitui 2016; ISO 22081:2021 substitui ISO 2768-2:1989, não a parte 1; ISO 21920-1:2021 substitui ISO 1302:2002. A família 128 tem partes próprias para linhas e vistas/cortes. Ver fontes e limites no registro. Não alterar automaticamente notas de desenhos legados: a edição contratual pode continuar aplicável mediante revisão explícita.</w:t>
+      </w:r>
+    </w:p>
+    <w:p>
+      <w:r>
+        <w:t>Para novas revisões, estabelecer fonte/configuração/revisão, material/processo e baseline de edições. Construir requisito → característica → vista/cota → aceitação → inspeção. Justificar vista principal, verificar projeção/símbolo/disposição e associatividade. Revisar datums conforme função/inspeção; não inventar tolerância a partir de casas decimais nem preencher evidência para satisfazer teste.</w:t>
+      </w:r>
+    </w:p>
+    <w:p>
+      <w:r>
+        <w:t>O verificador tools/review_drawing.py processa JSON local com o perfil interno engineering_v2. Verifica estrutura, vínculos, IDs, valores, tolerâncias, edições e evidências declaradas; não mede CAD, não autentica declarações, não implementa todas as regras ISO e não certifica fabricação. A CLI usa somente Python padrão, sem rede ou conexão COM, e recusa sobrescrita:</w:t>
+      </w:r>
+    </w:p>
+    <w:p>
+      <w:pPr>
+        <w:spacing w:before="80" w:after="180"/>
+      </w:pPr>
+      <w:r>
+        <w:rPr>
+          <w:rFonts w:ascii="Consolas" w:hAnsi="Consolas"/>
+          <w:sz w:val="16"/>
+        </w:rPr>
+        <w:t>if (-not (Test-Path output)) { New-Item -ItemType Directory output }</w:t>
+        <w:br/>
+        <w:t>python tools/review_drawing.py examples/drawing-review.synthetic.json output/drawing-review.json</w:t>
+      </w:r>
+    </w:p>
+    <w:p>
+      <w:r>
+        <w:t>O exemplo contém dados inventados exclusivamente para teste, inclusive hash, material, tolerâncias e afirmações de revisão. Não é evidência de um desenho real. Resultado esperado: review_required, release=NOT_AUTHORIZED e iso_compliant=null. Exit 0 significa processamento sem bloqueios estruturais, não aprovação; exit 2 significa bloqueio. Reutilização exige substituir afirmações por evidência verdadeira e manter revisão humana/normativa.</w:t>
+      </w:r>
+    </w:p>
+    <w:p>
+      <w:r>
+        <w:t>Preservar o método no Git permite recuperar conhecimento em outra máquina ou sessão; não retreina permanentemente a IA. Para atualizar, confirmar fontes oficiais/edições, registrar nível real de acesso e alterações, executar testes negativos, revisar privacidade e publicar só quando autorizado. Fontes licenciadas/evidências reais ficam fora do repo. Não contornar paywall ou redistribuir normas. Use prompts/06-revisao-normativa.md (prompts/06-revisao-normativa.md) para orientar a próxima sessão.</w:t>
       </w:r>
     </w:p>
     <w:sectPr>

</xml_diff>